<commit_message>
3AS probability plans: counting for all streams; conditional probability and trees not for technical maths (teacher's correction)
Co-Authored-By: Claude Opus 5.5 <noreply@anthropic.com>
Claude-Session: https://claude.ai/code/session_015WVgZKTbSWpZTjn6aZsqC9
</commit_message>
<xml_diff>
--- a/documents/3as/modhakirat/modhakira_wahda7_3as.docx
+++ b/documents/3as/modhakirat/modhakira_wahda7_3as.docx
@@ -70,7 +70,7 @@
                 <w:szCs w:val="30"/>
                 <w:rtl/>
               </w:rPr>
-              <w:t xml:space="preserve">11 مذكرة (22 ساعة) ، منها 2 لشعبتي رياضيات وتقني رياضي – 2026-2027</w:t>
+              <w:t xml:space="preserve">11 مذكرة (22 ساعة) – السنة الدراسية 2026-2027</w:t>
             </w:r>
           </w:p>
         </w:tc>
@@ -194,27 +194,7 @@
               <w:rPr>
                 <w:rtl/>
               </w:rPr>
-              <w:t xml:space="preserve">القوائم والترتيبات</w:t>
-            </w:r>
-            <w:r>
-              <w:rPr>
-                <w:rtl/>
-              </w:rPr>
-              <w:t xml:space="preserve"> </w:t>
-            </w:r>
-            <w:r>
-              <w:rPr>
-                <w:b/>
-                <w:bCs/>
-                <w:rtl/>
-              </w:rPr>
-              <w:t xml:space="preserve">(رياضيات وتقني رياضي)</w:t>
-            </w:r>
-            <w:r>
-              <w:rPr>
-                <w:rtl/>
-              </w:rPr>
-              <w:t xml:space="preserve">.</w:t>
+              <w:t xml:space="preserve">القوائم والترتيبات.</w:t>
             </w:r>
           </w:p>
           <w:p>
@@ -229,27 +209,7 @@
               <w:rPr>
                 <w:rtl/>
               </w:rPr>
-              <w:t xml:space="preserve">التبديلات واختيار أداة العد</w:t>
-            </w:r>
-            <w:r>
-              <w:rPr>
-                <w:rtl/>
-              </w:rPr>
-              <w:t xml:space="preserve"> </w:t>
-            </w:r>
-            <w:r>
-              <w:rPr>
-                <w:b/>
-                <w:bCs/>
-                <w:rtl/>
-              </w:rPr>
-              <w:t xml:space="preserve">(رياضيات وتقني رياضي)</w:t>
-            </w:r>
-            <w:r>
-              <w:rPr>
-                <w:rtl/>
-              </w:rPr>
-              <w:t xml:space="preserve">.</w:t>
+              <w:t xml:space="preserve">التبديلات واختيار أداة العد.</w:t>
             </w:r>
           </w:p>
           <w:p>
@@ -294,7 +254,27 @@
               <w:rPr>
                 <w:rtl/>
               </w:rPr>
-              <w:t xml:space="preserve">الاحتمالات الشرطية.</w:t>
+              <w:t xml:space="preserve">الاحتمالات الشرطية</w:t>
+            </w:r>
+            <w:r>
+              <w:rPr>
+                <w:rtl/>
+              </w:rPr>
+              <w:t xml:space="preserve"> </w:t>
+            </w:r>
+            <w:r>
+              <w:rPr>
+                <w:b/>
+                <w:bCs/>
+                <w:rtl/>
+              </w:rPr>
+              <w:t xml:space="preserve">(علوم تجريبية ورياضيات)</w:t>
+            </w:r>
+            <w:r>
+              <w:rPr>
+                <w:rtl/>
+              </w:rPr>
+              <w:t xml:space="preserve">.</w:t>
             </w:r>
           </w:p>
           <w:p>
@@ -309,7 +289,27 @@
               <w:rPr>
                 <w:rtl/>
               </w:rPr>
-              <w:t xml:space="preserve">شجرة الاحتمالات ، دستور الاحتمالات الكلية.</w:t>
+              <w:t xml:space="preserve">شجرة الاحتمالات ، دستور الاحتمالات الكلية</w:t>
+            </w:r>
+            <w:r>
+              <w:rPr>
+                <w:rtl/>
+              </w:rPr>
+              <w:t xml:space="preserve"> </w:t>
+            </w:r>
+            <w:r>
+              <w:rPr>
+                <w:b/>
+                <w:bCs/>
+                <w:rtl/>
+              </w:rPr>
+              <w:t xml:space="preserve">(علوم تجريبية ورياضيات)</w:t>
+            </w:r>
+            <w:r>
+              <w:rPr>
+                <w:rtl/>
+              </w:rPr>
+              <w:t xml:space="preserve">.</w:t>
             </w:r>
           </w:p>
           <w:p>
@@ -324,7 +324,27 @@
               <w:rPr>
                 <w:rtl/>
               </w:rPr>
-              <w:t xml:space="preserve">الحوادث المستقلة.</w:t>
+              <w:t xml:space="preserve">الحوادث المستقلة</w:t>
+            </w:r>
+            <w:r>
+              <w:rPr>
+                <w:rtl/>
+              </w:rPr>
+              <w:t xml:space="preserve"> </w:t>
+            </w:r>
+            <w:r>
+              <w:rPr>
+                <w:b/>
+                <w:bCs/>
+                <w:rtl/>
+              </w:rPr>
+              <w:t xml:space="preserve">(علوم تجريبية ورياضيات)</w:t>
+            </w:r>
+            <w:r>
+              <w:rPr>
+                <w:rtl/>
+              </w:rPr>
+              <w:t xml:space="preserve">.</w:t>
             </w:r>
           </w:p>
           <w:p>
@@ -350,7 +370,7 @@
               <w:rPr>
                 <w:rtl/>
               </w:rPr>
-              <w:t xml:space="preserve">مراجع النشاطات والتمارين: الكتاب المدرسي للسنة الثالثة ثانوي ، الجزء الثاني (باب الاحتمالات: نشاط ص 201 ، تمارين ص 219–224). المذكرتان 49 و 50 خاصتان بشعبتي رياضيات وتقني رياضي (القوائم ، الترتيبات ، التبديلات) ؛ شعبة العلوم التجريبية تكتفي بالتوفيقات ودستور ثنائي الحد.</w:t>
+              <w:t xml:space="preserve">مراجع النشاطات والتمارين: الكتاب المدرسي للسنة الثالثة ثانوي ، الجزء الثاني (باب الاحتمالات: نشاط ص 201 ، تمارين ص 219–224). القوائم والترتيبات والتوفيقات لكل الشعب العلمية. المذكرات 53 و 54 و 55 (الاحتمالات الشرطية ، شجرة الاحتمالات ، الاستقلال) لا تدرسها شعبة تقني رياضي.</w:t>
             </w:r>
           </w:p>
         </w:tc>
@@ -474,7 +494,7 @@
                     <w:rPr>
                       <w:rtl/>
                     </w:rPr>
-                    <w:t xml:space="preserve">3 ع ت</w:t>
+                    <w:t xml:space="preserve">3 ع ت / 3 ر / 3 ت ر</w:t>
                   </w:r>
                 </w:p>
               </w:tc>
@@ -2205,7 +2225,7 @@
                     <w:rPr>
                       <w:rtl/>
                     </w:rPr>
-                    <w:t xml:space="preserve">3 ع ت</w:t>
+                    <w:t xml:space="preserve">3 ع ت / 3 ر / 3 ت ر</w:t>
                   </w:r>
                 </w:p>
               </w:tc>
@@ -4255,7 +4275,7 @@
                     <w:rPr>
                       <w:rtl/>
                     </w:rPr>
-                    <w:t xml:space="preserve">3 ع ت</w:t>
+                    <w:t xml:space="preserve">3 ع ت / 3 ر / 3 ت ر</w:t>
                   </w:r>
                 </w:p>
               </w:tc>
@@ -5864,7 +5884,7 @@
                     <w:rPr>
                       <w:rtl/>
                     </w:rPr>
-                    <w:t xml:space="preserve">3 ر / 3 ت ر</w:t>
+                    <w:t xml:space="preserve">3 ع ت / 3 ر / 3 ت ر</w:t>
                   </w:r>
                 </w:p>
               </w:tc>
@@ -6080,7 +6100,7 @@
                     <w:rPr>
                       <w:rtl/>
                     </w:rPr>
-                    <w:t xml:space="preserve">القوائم والترتيبات (شعبتا رياضيات وتقني رياضي)</w:t>
+                    <w:t xml:space="preserve">القوائم والترتيبات</w:t>
                   </w:r>
                 </w:p>
               </w:tc>
@@ -7871,7 +7891,7 @@
                     <w:rPr>
                       <w:rtl/>
                     </w:rPr>
-                    <w:t xml:space="preserve">3 ر / 3 ت ر</w:t>
+                    <w:t xml:space="preserve">3 ع ت / 3 ر / 3 ت ر</w:t>
                   </w:r>
                 </w:p>
               </w:tc>
@@ -8087,7 +8107,7 @@
                     <w:rPr>
                       <w:rtl/>
                     </w:rPr>
-                    <w:t xml:space="preserve">التبديلات واختيار أداة العد (شعبتا رياضيات وتقني رياضي)</w:t>
+                    <w:t xml:space="preserve">التبديلات واختيار أداة العد</w:t>
                   </w:r>
                 </w:p>
               </w:tc>
@@ -9442,7 +9462,7 @@
                     <w:rPr>
                       <w:rtl/>
                     </w:rPr>
-                    <w:t xml:space="preserve">3 ع ت</w:t>
+                    <w:t xml:space="preserve">3 ع ت / 3 ر / 3 ت ر</w:t>
                   </w:r>
                 </w:p>
               </w:tc>
@@ -11496,7 +11516,7 @@
                     <w:rPr>
                       <w:rtl/>
                     </w:rPr>
-                    <w:t xml:space="preserve">3 ع ت</w:t>
+                    <w:t xml:space="preserve">3 ع ت / 3 ر / 3 ت ر</w:t>
                   </w:r>
                 </w:p>
               </w:tc>
@@ -13374,7 +13394,7 @@
                     <w:rPr>
                       <w:rtl/>
                     </w:rPr>
-                    <w:t xml:space="preserve">3 ع ت</w:t>
+                    <w:t xml:space="preserve">3 ع ت / 3 ر</w:t>
                   </w:r>
                 </w:p>
               </w:tc>
@@ -13590,7 +13610,7 @@
                     <w:rPr>
                       <w:rtl/>
                     </w:rPr>
-                    <w:t xml:space="preserve">الاحتمالات الشرطية</w:t>
+                    <w:t xml:space="preserve">الاحتمالات الشرطية (علوم تجريبية ورياضيات)</w:t>
                   </w:r>
                 </w:p>
               </w:tc>
@@ -15469,7 +15489,7 @@
                     <w:rPr>
                       <w:rtl/>
                     </w:rPr>
-                    <w:t xml:space="preserve">3 ع ت</w:t>
+                    <w:t xml:space="preserve">3 ع ت / 3 ر</w:t>
                   </w:r>
                 </w:p>
               </w:tc>
@@ -15685,7 +15705,7 @@
                     <w:rPr>
                       <w:rtl/>
                     </w:rPr>
-                    <w:t xml:space="preserve">شجرة الاحتمالات ، دستور الاحتمالات الكلية</w:t>
+                    <w:t xml:space="preserve">شجرة الاحتمالات ، دستور الاحتمالات الكلية (علوم تجريبية ورياضيات)</w:t>
                   </w:r>
                 </w:p>
               </w:tc>
@@ -17535,7 +17555,7 @@
                     <w:rPr>
                       <w:rtl/>
                     </w:rPr>
-                    <w:t xml:space="preserve">3 ع ت</w:t>
+                    <w:t xml:space="preserve">3 ع ت / 3 ر</w:t>
                   </w:r>
                 </w:p>
               </w:tc>
@@ -17751,7 +17771,7 @@
                     <w:rPr>
                       <w:rtl/>
                     </w:rPr>
-                    <w:t xml:space="preserve">الحوادث المستقلة</w:t>
+                    <w:t xml:space="preserve">الحوادث المستقلة (علوم تجريبية ورياضيات)</w:t>
                   </w:r>
                 </w:p>
               </w:tc>
@@ -19666,7 +19686,7 @@
                     <w:rPr>
                       <w:rtl/>
                     </w:rPr>
-                    <w:t xml:space="preserve">3 ع ت</w:t>
+                    <w:t xml:space="preserve">3 ع ت / 3 ر / 3 ت ر</w:t>
                   </w:r>
                 </w:p>
               </w:tc>

</xml_diff>